<commit_message>
Vendor-style test upload: D-range sets, pictures, optional option E, richer question details
- Word: Topic / Q.n) / a)-e) / Answer / Explanation; D.51-55) groups RC and DILR sets; pictures upload to the media table
- Option E only where a question has five options (bank form shows it on demand)
- Excel details: Type, Difficulty Level (Very Easy-Very Hard), Concepts, Source, Subject paths fill section > topic > subtopic
- Guru sees the student's weakest topics with unseen bank question counts
- Indexes for topic/level, subtopic and tag lookups; new templates

Co-Authored-By: Claude Opus 5.5 <noreply@anthropic.com>
Claude-Session: https://claude.ai/code/session_01HobNgf1JPqeUaeRZMhfYbX
</commit_message>
<xml_diff>
--- a/portal/public/test-upload-template.docx
+++ b/portal/public/test-upload-template.docx
@@ -12,185 +12,211 @@
     </w:p>
     <w:p>
       <w:r>
-        <w:rPr>
-          <w:i/>
-          <w:color w:val="5A5F78"/>
-        </w:rPr>
-        <w:t>This file holds the test itself: test name, sections, questions, options, answers and solutions.</w:t>
+        <w:t>This file holds the test itself. For each question write: Topic, the question, its options, Answer and Explanation. Everything else (subtopic, difficulty, type, time, marks, concepts, source) goes in the Excel details sheet, one row per question number.</w:t>
       </w:r>
     </w:p>
     <w:p>
       <w:r>
-        <w:rPr>
-          <w:i/>
-          <w:color w:val="5A5F78"/>
-        </w:rPr>
-        <w:t>Topic, subtopic, difficulty, ideal time and marks go in the Excel details sheet (question-details-template.xlsx), matched by Test, Section and question number.</w:t>
+        <w:t>Rules: keep the words "Test:", "Section:", "Topic:", "Answer:" and "Explanation:" exactly. Number questions Q.1) Q.2) … (or 1. 2. or Word numbering).</w:t>
       </w:r>
     </w:p>
     <w:p>
       <w:r>
-        <w:rPr>
-          <w:i/>
-          <w:color w:val="5A5F78"/>
-        </w:rPr>
-        <w:t>Rules: keep the words "Test:", "Section:", "Directions:", "Answer:" and "Solution:" exactly. Number the questions (1. 2. 3. or Word numbering). Options as (A) (B) (C) (D). For a type-in (TITA) question, leave out the options and write the number as the answer. Start each new test with a new "Test:" line. Everything above the first "Test:" line (like these notes) is ignored.</w:t>
+        <w:t>Options: a) b) c) d). Add e) only when that question has five options; each question gets exactly the options you write, so 4-option and 5-option exams both work. For a type-in (numeric) question, leave out the options and write the number as the answer.</w:t>
       </w:r>
     </w:p>
     <w:p>
       <w:r>
-        <w:rPr>
-          <w:i/>
-          <w:color w:val="5A5F78"/>
-        </w:rPr>
-        <w:t>Upload: Admin → Tests → Upload tests (Excel or Word). Add the details sheet in the same screen.</w:t>
+        <w:t>Topic: applies to the questions below it until the next Topic: line.</w:t>
       </w:r>
     </w:p>
     <w:p>
       <w:r>
-        <w:rPr>
-          <w:b/>
-        </w:rPr>
+        <w:t>RC passages and DILR / DI sets: write D.3-5) and then the passage, directions, table or picture, just before question 3. Questions 3 to 5 share it, show it on the left of the screen and are always picked together.</w:t>
+      </w:r>
+    </w:p>
+    <w:p>
+      <w:r>
+        <w:t>Pictures (graphs, figures, tables as images) can be pasted straight into the question, an option, the explanation or a D.x-y) set. They are uploaded with the test.</w:t>
+      </w:r>
+    </w:p>
+    <w:p>
+      <w:r>
+        <w:t>Start each new test with a new "Test:" line and each section with "Section:". Everything above the first "Test:" line (like these notes) is ignored.</w:t>
+      </w:r>
+    </w:p>
+    <w:p>
+      <w:r>
+        <w:t>Upload: Admin → Tests → Upload tests, choosing the exam. One file = one exam (the Bank PO test at the end only shows five options; upload such tests separately under that exam). Add the Excel details sheet in the same screen.</w:t>
+      </w:r>
+    </w:p>
+    <w:p>
+      <w:r>
         <w:t>Test: CAT Mock 1</w:t>
       </w:r>
     </w:p>
     <w:p>
       <w:r>
-        <w:rPr>
-          <w:b/>
-        </w:rPr>
         <w:t>Section: VARC</w:t>
       </w:r>
     </w:p>
     <w:p>
       <w:r>
-        <w:t>Directions: Read the passage and answer the questions that follow.</w:t>
+        <w:t>Topic: Reading Comprehension</w:t>
       </w:r>
     </w:p>
     <w:p>
       <w:r>
-        <w:t>Paste the passage here. It stays on the left of the screen for every question until the next Section or Directions line.</w:t>
+        <w:t>D.1-2) Read the passage and answer the questions that follow.</w:t>
       </w:r>
     </w:p>
     <w:p>
       <w:r>
-        <w:t>1. What is the main idea of the passage?</w:t>
+        <w:t>Paste the passage here. Questions 1 and 2 show it on the left of the screen.</w:t>
       </w:r>
     </w:p>
     <w:p>
       <w:r>
-        <w:t>(A) First option</w:t>
+        <w:t>Q.1) What is the main idea of the passage?</w:t>
       </w:r>
     </w:p>
     <w:p>
       <w:r>
-        <w:t>(B) Second option</w:t>
+        <w:t>a) First option</w:t>
       </w:r>
     </w:p>
     <w:p>
       <w:r>
-        <w:t>(C) Third option</w:t>
+        <w:t>b) Second option</w:t>
       </w:r>
     </w:p>
     <w:p>
       <w:r>
-        <w:t>(D) Fourth option</w:t>
+        <w:t>c) Third option</w:t>
       </w:r>
     </w:p>
     <w:p>
       <w:r>
-        <w:t>Answer: B</w:t>
+        <w:t>d) Fourth option</w:t>
       </w:r>
     </w:p>
     <w:p>
       <w:r>
-        <w:t>Solution: Explain why B is right.</w:t>
+        <w:t>Answer: b</w:t>
+      </w:r>
+    </w:p>
+    <w:p>
+      <w:r>
+        <w:t>Explanation: Explain why b is right.</w:t>
       </w:r>
     </w:p>
     <w:p/>
     <w:p>
       <w:r>
-        <w:t>2. The author would most likely agree that…</w:t>
+        <w:t>Q.2) The author would most likely agree that…</w:t>
       </w:r>
     </w:p>
     <w:p>
       <w:r>
-        <w:t>(A) First option</w:t>
+        <w:t>a) First option</w:t>
       </w:r>
     </w:p>
     <w:p>
       <w:r>
-        <w:t>(B) Second option</w:t>
+        <w:t>b) Second option</w:t>
       </w:r>
     </w:p>
     <w:p>
       <w:r>
-        <w:t>(C) Third option</w:t>
+        <w:t>c) Third option</w:t>
       </w:r>
     </w:p>
     <w:p>
       <w:r>
-        <w:t>(D) Fourth option</w:t>
+        <w:t>d) Fourth option</w:t>
       </w:r>
     </w:p>
     <w:p>
       <w:r>
-        <w:t>Answer: D</w:t>
+        <w:t>Answer: d</w:t>
       </w:r>
     </w:p>
     <w:p>
       <w:r>
-        <w:t>Solution: Explain why D is right.</w:t>
+        <w:t>Explanation: Explain why d is right.</w:t>
       </w:r>
     </w:p>
     <w:p/>
     <w:p>
       <w:r>
-        <w:rPr>
-          <w:b/>
-        </w:rPr>
+        <w:t>Topic: Para Jumbles</w:t>
+      </w:r>
+    </w:p>
+    <w:p>
+      <w:r>
+        <w:t>Q.3) Arrange the sentences into a paragraph. Type the order, e.g. 2143.</w:t>
+      </w:r>
+    </w:p>
+    <w:p>
+      <w:r>
+        <w:t>Answer: 2143</w:t>
+      </w:r>
+    </w:p>
+    <w:p>
+      <w:r>
+        <w:t>Explanation: …</w:t>
+      </w:r>
+    </w:p>
+    <w:p/>
+    <w:p>
+      <w:r>
         <w:t>Section: QA</w:t>
       </w:r>
     </w:p>
     <w:p>
       <w:r>
-        <w:t>1. A price rises by 20% and then falls by 20%. What is the net change?</w:t>
+        <w:t>Topic: Percentages</w:t>
       </w:r>
     </w:p>
     <w:p>
       <w:r>
-        <w:t>(A) No change</w:t>
+        <w:t>Q.1) A price rises by 20% and then falls by 20%. What is the net change?</w:t>
       </w:r>
     </w:p>
     <w:p>
       <w:r>
-        <w:t>(B) 4% decrease</w:t>
+        <w:t>a) No change</w:t>
       </w:r>
     </w:p>
     <w:p>
       <w:r>
-        <w:t>(C) 4% increase</w:t>
+        <w:t>b) 4% decrease</w:t>
       </w:r>
     </w:p>
     <w:p>
       <w:r>
-        <w:t>(D) 2% decrease</w:t>
+        <w:t>c) 4% increase</w:t>
       </w:r>
     </w:p>
     <w:p>
       <w:r>
-        <w:t>Answer: B</w:t>
+        <w:t>d) 2% decrease</w:t>
       </w:r>
     </w:p>
     <w:p>
       <w:r>
-        <w:t>Solution: 1.2 × 0.8 = 0.96, so a 4% decrease.</w:t>
+        <w:t>Answer: b</w:t>
+      </w:r>
+    </w:p>
+    <w:p>
+      <w:r>
+        <w:t>Explanation: 1.2 × 0.8 = 0.96, so a 4% decrease.</w:t>
       </w:r>
     </w:p>
     <w:p/>
     <w:p>
       <w:r>
-        <w:t>2. What is 15% of 200?</w:t>
+        <w:t>Q.2) What is 15% of 200?</w:t>
       </w:r>
     </w:p>
     <w:p>
@@ -200,59 +226,109 @@
     </w:p>
     <w:p>
       <w:r>
-        <w:t>Solution: 0.15 × 200 = 30.</w:t>
+        <w:t>Explanation: 0.15 × 200 = 30.</w:t>
       </w:r>
     </w:p>
     <w:p/>
     <w:p>
       <w:r>
-        <w:rPr>
-          <w:b/>
-        </w:rPr>
-        <w:t>Test: CAT Mock 2</w:t>
+        <w:t>Test: Bank PO Mock 1</w:t>
       </w:r>
     </w:p>
     <w:p>
       <w:r>
-        <w:rPr>
-          <w:b/>
-        </w:rPr>
         <w:t>Section: QA</w:t>
       </w:r>
     </w:p>
     <w:p>
       <w:r>
-        <w:t>1. First question of the next test…</w:t>
+        <w:t>Topic: Data Interpretation</w:t>
       </w:r>
     </w:p>
     <w:p>
       <w:r>
-        <w:t>(A) …</w:t>
+        <w:t>D.1-2) Study the graph carefully to answer the questions that follow. (Paste the graph picture here.)</w:t>
       </w:r>
     </w:p>
     <w:p>
       <w:r>
-        <w:t>(B) …</w:t>
+        <w:t>Q.1) In which city is the difference second lowest?</w:t>
       </w:r>
     </w:p>
     <w:p>
       <w:r>
-        <w:t>(C) …</w:t>
+        <w:t>a) Jalandhar</w:t>
       </w:r>
     </w:p>
     <w:p>
       <w:r>
-        <w:t>(D) …</w:t>
+        <w:t>b) Delhi</w:t>
       </w:r>
     </w:p>
     <w:p>
       <w:r>
-        <w:t>Answer: A</w:t>
+        <w:t>c) Chandigarh</w:t>
       </w:r>
     </w:p>
     <w:p>
       <w:r>
-        <w:t>Solution: …</w:t>
+        <w:t>d) Hoshiarpur</w:t>
+      </w:r>
+    </w:p>
+    <w:p>
+      <w:r>
+        <w:t>e) Ropar</w:t>
+      </w:r>
+    </w:p>
+    <w:p>
+      <w:r>
+        <w:t>Answer: b</w:t>
+      </w:r>
+    </w:p>
+    <w:p>
+      <w:r>
+        <w:t>Explanation: …</w:t>
+      </w:r>
+    </w:p>
+    <w:p/>
+    <w:p>
+      <w:r>
+        <w:t>Q.2) What is the ratio of A to B?</w:t>
+      </w:r>
+    </w:p>
+    <w:p>
+      <w:r>
+        <w:t>a) 3 : 2</w:t>
+      </w:r>
+    </w:p>
+    <w:p>
+      <w:r>
+        <w:t>b) 2 : 3</w:t>
+      </w:r>
+    </w:p>
+    <w:p>
+      <w:r>
+        <w:t>c) 4 : 3</w:t>
+      </w:r>
+    </w:p>
+    <w:p>
+      <w:r>
+        <w:t>d) 3 : 4</w:t>
+      </w:r>
+    </w:p>
+    <w:p>
+      <w:r>
+        <w:t>e) None of these</w:t>
+      </w:r>
+    </w:p>
+    <w:p>
+      <w:r>
+        <w:t>Answer: a</w:t>
+      </w:r>
+    </w:p>
+    <w:p>
+      <w:r>
+        <w:t>Explanation: …</w:t>
       </w:r>
     </w:p>
     <w:sectPr>

</xml_diff>

<commit_message>
Vendor-style test upload: D-range sets, pictures, optional option E, richer question details (#13)
- Word: Topic / Q.n) / a)-e) / Answer / Explanation; D.51-55) groups RC and DILR sets; pictures upload to the media table
- Option E only where a question has five options (bank form shows it on demand)
- Excel details: Type, Difficulty Level (Very Easy-Very Hard), Concepts, Source, Subject paths fill section > topic > subtopic
- Guru sees the student's weakest topics with unseen bank question counts
- Indexes for topic/level, subtopic and tag lookups; new templates


Claude-Session: https://claude.ai/code/session_01HobNgf1JPqeUaeRZMhfYbX

Co-authored-by: Claude <noreply@anthropic.com>
</commit_message>
<xml_diff>
--- a/portal/public/test-upload-template.docx
+++ b/portal/public/test-upload-template.docx
@@ -12,185 +12,211 @@
     </w:p>
     <w:p>
       <w:r>
-        <w:rPr>
-          <w:i/>
-          <w:color w:val="5A5F78"/>
-        </w:rPr>
-        <w:t>This file holds the test itself: test name, sections, questions, options, answers and solutions.</w:t>
+        <w:t>This file holds the test itself. For each question write: Topic, the question, its options, Answer and Explanation. Everything else (subtopic, difficulty, type, time, marks, concepts, source) goes in the Excel details sheet, one row per question number.</w:t>
       </w:r>
     </w:p>
     <w:p>
       <w:r>
-        <w:rPr>
-          <w:i/>
-          <w:color w:val="5A5F78"/>
-        </w:rPr>
-        <w:t>Topic, subtopic, difficulty, ideal time and marks go in the Excel details sheet (question-details-template.xlsx), matched by Test, Section and question number.</w:t>
+        <w:t>Rules: keep the words "Test:", "Section:", "Topic:", "Answer:" and "Explanation:" exactly. Number questions Q.1) Q.2) … (or 1. 2. or Word numbering).</w:t>
       </w:r>
     </w:p>
     <w:p>
       <w:r>
-        <w:rPr>
-          <w:i/>
-          <w:color w:val="5A5F78"/>
-        </w:rPr>
-        <w:t>Rules: keep the words "Test:", "Section:", "Directions:", "Answer:" and "Solution:" exactly. Number the questions (1. 2. 3. or Word numbering). Options as (A) (B) (C) (D). For a type-in (TITA) question, leave out the options and write the number as the answer. Start each new test with a new "Test:" line. Everything above the first "Test:" line (like these notes) is ignored.</w:t>
+        <w:t>Options: a) b) c) d). Add e) only when that question has five options; each question gets exactly the options you write, so 4-option and 5-option exams both work. For a type-in (numeric) question, leave out the options and write the number as the answer.</w:t>
       </w:r>
     </w:p>
     <w:p>
       <w:r>
-        <w:rPr>
-          <w:i/>
-          <w:color w:val="5A5F78"/>
-        </w:rPr>
-        <w:t>Upload: Admin → Tests → Upload tests (Excel or Word). Add the details sheet in the same screen.</w:t>
+        <w:t>Topic: applies to the questions below it until the next Topic: line.</w:t>
       </w:r>
     </w:p>
     <w:p>
       <w:r>
-        <w:rPr>
-          <w:b/>
-        </w:rPr>
+        <w:t>RC passages and DILR / DI sets: write D.3-5) and then the passage, directions, table or picture, just before question 3. Questions 3 to 5 share it, show it on the left of the screen and are always picked together.</w:t>
+      </w:r>
+    </w:p>
+    <w:p>
+      <w:r>
+        <w:t>Pictures (graphs, figures, tables as images) can be pasted straight into the question, an option, the explanation or a D.x-y) set. They are uploaded with the test.</w:t>
+      </w:r>
+    </w:p>
+    <w:p>
+      <w:r>
+        <w:t>Start each new test with a new "Test:" line and each section with "Section:". Everything above the first "Test:" line (like these notes) is ignored.</w:t>
+      </w:r>
+    </w:p>
+    <w:p>
+      <w:r>
+        <w:t>Upload: Admin → Tests → Upload tests, choosing the exam. One file = one exam (the Bank PO test at the end only shows five options; upload such tests separately under that exam). Add the Excel details sheet in the same screen.</w:t>
+      </w:r>
+    </w:p>
+    <w:p>
+      <w:r>
         <w:t>Test: CAT Mock 1</w:t>
       </w:r>
     </w:p>
     <w:p>
       <w:r>
-        <w:rPr>
-          <w:b/>
-        </w:rPr>
         <w:t>Section: VARC</w:t>
       </w:r>
     </w:p>
     <w:p>
       <w:r>
-        <w:t>Directions: Read the passage and answer the questions that follow.</w:t>
+        <w:t>Topic: Reading Comprehension</w:t>
       </w:r>
     </w:p>
     <w:p>
       <w:r>
-        <w:t>Paste the passage here. It stays on the left of the screen for every question until the next Section or Directions line.</w:t>
+        <w:t>D.1-2) Read the passage and answer the questions that follow.</w:t>
       </w:r>
     </w:p>
     <w:p>
       <w:r>
-        <w:t>1. What is the main idea of the passage?</w:t>
+        <w:t>Paste the passage here. Questions 1 and 2 show it on the left of the screen.</w:t>
       </w:r>
     </w:p>
     <w:p>
       <w:r>
-        <w:t>(A) First option</w:t>
+        <w:t>Q.1) What is the main idea of the passage?</w:t>
       </w:r>
     </w:p>
     <w:p>
       <w:r>
-        <w:t>(B) Second option</w:t>
+        <w:t>a) First option</w:t>
       </w:r>
     </w:p>
     <w:p>
       <w:r>
-        <w:t>(C) Third option</w:t>
+        <w:t>b) Second option</w:t>
       </w:r>
     </w:p>
     <w:p>
       <w:r>
-        <w:t>(D) Fourth option</w:t>
+        <w:t>c) Third option</w:t>
       </w:r>
     </w:p>
     <w:p>
       <w:r>
-        <w:t>Answer: B</w:t>
+        <w:t>d) Fourth option</w:t>
       </w:r>
     </w:p>
     <w:p>
       <w:r>
-        <w:t>Solution: Explain why B is right.</w:t>
+        <w:t>Answer: b</w:t>
+      </w:r>
+    </w:p>
+    <w:p>
+      <w:r>
+        <w:t>Explanation: Explain why b is right.</w:t>
       </w:r>
     </w:p>
     <w:p/>
     <w:p>
       <w:r>
-        <w:t>2. The author would most likely agree that…</w:t>
+        <w:t>Q.2) The author would most likely agree that…</w:t>
       </w:r>
     </w:p>
     <w:p>
       <w:r>
-        <w:t>(A) First option</w:t>
+        <w:t>a) First option</w:t>
       </w:r>
     </w:p>
     <w:p>
       <w:r>
-        <w:t>(B) Second option</w:t>
+        <w:t>b) Second option</w:t>
       </w:r>
     </w:p>
     <w:p>
       <w:r>
-        <w:t>(C) Third option</w:t>
+        <w:t>c) Third option</w:t>
       </w:r>
     </w:p>
     <w:p>
       <w:r>
-        <w:t>(D) Fourth option</w:t>
+        <w:t>d) Fourth option</w:t>
       </w:r>
     </w:p>
     <w:p>
       <w:r>
-        <w:t>Answer: D</w:t>
+        <w:t>Answer: d</w:t>
       </w:r>
     </w:p>
     <w:p>
       <w:r>
-        <w:t>Solution: Explain why D is right.</w:t>
+        <w:t>Explanation: Explain why d is right.</w:t>
       </w:r>
     </w:p>
     <w:p/>
     <w:p>
       <w:r>
-        <w:rPr>
-          <w:b/>
-        </w:rPr>
+        <w:t>Topic: Para Jumbles</w:t>
+      </w:r>
+    </w:p>
+    <w:p>
+      <w:r>
+        <w:t>Q.3) Arrange the sentences into a paragraph. Type the order, e.g. 2143.</w:t>
+      </w:r>
+    </w:p>
+    <w:p>
+      <w:r>
+        <w:t>Answer: 2143</w:t>
+      </w:r>
+    </w:p>
+    <w:p>
+      <w:r>
+        <w:t>Explanation: …</w:t>
+      </w:r>
+    </w:p>
+    <w:p/>
+    <w:p>
+      <w:r>
         <w:t>Section: QA</w:t>
       </w:r>
     </w:p>
     <w:p>
       <w:r>
-        <w:t>1. A price rises by 20% and then falls by 20%. What is the net change?</w:t>
+        <w:t>Topic: Percentages</w:t>
       </w:r>
     </w:p>
     <w:p>
       <w:r>
-        <w:t>(A) No change</w:t>
+        <w:t>Q.1) A price rises by 20% and then falls by 20%. What is the net change?</w:t>
       </w:r>
     </w:p>
     <w:p>
       <w:r>
-        <w:t>(B) 4% decrease</w:t>
+        <w:t>a) No change</w:t>
       </w:r>
     </w:p>
     <w:p>
       <w:r>
-        <w:t>(C) 4% increase</w:t>
+        <w:t>b) 4% decrease</w:t>
       </w:r>
     </w:p>
     <w:p>
       <w:r>
-        <w:t>(D) 2% decrease</w:t>
+        <w:t>c) 4% increase</w:t>
       </w:r>
     </w:p>
     <w:p>
       <w:r>
-        <w:t>Answer: B</w:t>
+        <w:t>d) 2% decrease</w:t>
       </w:r>
     </w:p>
     <w:p>
       <w:r>
-        <w:t>Solution: 1.2 × 0.8 = 0.96, so a 4% decrease.</w:t>
+        <w:t>Answer: b</w:t>
+      </w:r>
+    </w:p>
+    <w:p>
+      <w:r>
+        <w:t>Explanation: 1.2 × 0.8 = 0.96, so a 4% decrease.</w:t>
       </w:r>
     </w:p>
     <w:p/>
     <w:p>
       <w:r>
-        <w:t>2. What is 15% of 200?</w:t>
+        <w:t>Q.2) What is 15% of 200?</w:t>
       </w:r>
     </w:p>
     <w:p>
@@ -200,59 +226,109 @@
     </w:p>
     <w:p>
       <w:r>
-        <w:t>Solution: 0.15 × 200 = 30.</w:t>
+        <w:t>Explanation: 0.15 × 200 = 30.</w:t>
       </w:r>
     </w:p>
     <w:p/>
     <w:p>
       <w:r>
-        <w:rPr>
-          <w:b/>
-        </w:rPr>
-        <w:t>Test: CAT Mock 2</w:t>
+        <w:t>Test: Bank PO Mock 1</w:t>
       </w:r>
     </w:p>
     <w:p>
       <w:r>
-        <w:rPr>
-          <w:b/>
-        </w:rPr>
         <w:t>Section: QA</w:t>
       </w:r>
     </w:p>
     <w:p>
       <w:r>
-        <w:t>1. First question of the next test…</w:t>
+        <w:t>Topic: Data Interpretation</w:t>
       </w:r>
     </w:p>
     <w:p>
       <w:r>
-        <w:t>(A) …</w:t>
+        <w:t>D.1-2) Study the graph carefully to answer the questions that follow. (Paste the graph picture here.)</w:t>
       </w:r>
     </w:p>
     <w:p>
       <w:r>
-        <w:t>(B) …</w:t>
+        <w:t>Q.1) In which city is the difference second lowest?</w:t>
       </w:r>
     </w:p>
     <w:p>
       <w:r>
-        <w:t>(C) …</w:t>
+        <w:t>a) Jalandhar</w:t>
       </w:r>
     </w:p>
     <w:p>
       <w:r>
-        <w:t>(D) …</w:t>
+        <w:t>b) Delhi</w:t>
       </w:r>
     </w:p>
     <w:p>
       <w:r>
-        <w:t>Answer: A</w:t>
+        <w:t>c) Chandigarh</w:t>
       </w:r>
     </w:p>
     <w:p>
       <w:r>
-        <w:t>Solution: …</w:t>
+        <w:t>d) Hoshiarpur</w:t>
+      </w:r>
+    </w:p>
+    <w:p>
+      <w:r>
+        <w:t>e) Ropar</w:t>
+      </w:r>
+    </w:p>
+    <w:p>
+      <w:r>
+        <w:t>Answer: b</w:t>
+      </w:r>
+    </w:p>
+    <w:p>
+      <w:r>
+        <w:t>Explanation: …</w:t>
+      </w:r>
+    </w:p>
+    <w:p/>
+    <w:p>
+      <w:r>
+        <w:t>Q.2) What is the ratio of A to B?</w:t>
+      </w:r>
+    </w:p>
+    <w:p>
+      <w:r>
+        <w:t>a) 3 : 2</w:t>
+      </w:r>
+    </w:p>
+    <w:p>
+      <w:r>
+        <w:t>b) 2 : 3</w:t>
+      </w:r>
+    </w:p>
+    <w:p>
+      <w:r>
+        <w:t>c) 4 : 3</w:t>
+      </w:r>
+    </w:p>
+    <w:p>
+      <w:r>
+        <w:t>d) 3 : 4</w:t>
+      </w:r>
+    </w:p>
+    <w:p>
+      <w:r>
+        <w:t>e) None of these</w:t>
+      </w:r>
+    </w:p>
+    <w:p>
+      <w:r>
+        <w:t>Answer: a</w:t>
+      </w:r>
+    </w:p>
+    <w:p>
+      <w:r>
+        <w:t>Explanation: …</w:t>
       </w:r>
     </w:p>
     <w:sectPr>

</xml_diff>